<commit_message>
Refactor index.html: Update styles for consistency, enhance Excel date handling, and improve dynamic payment list functionality. Bump version to v4 and remove outdated sample Excel file.
</commit_message>
<xml_diff>
--- a/assets/template_nghiem_thu.docx
+++ b/assets/template_nghiem_thu.docx
@@ -1220,7 +1220,7 @@
           <w:sz w:val="28"/>
           <w:szCs w:val="28"/>
         </w:rPr>
-        <w:t>{{DONG_GD_2}}</w:t>
+        <w:t>{{DONG_GIAI_DOAN}}</w:t>
       </w:r>
     </w:p>
     <w:p>
@@ -1241,7 +1241,7 @@
           <w:sz w:val="28"/>
           <w:szCs w:val="28"/>
         </w:rPr>
-        <w:t>{{DONG_GD_3}}</w:t>
+        <w:t>{{DONG_GIAI_DOAN}}</w:t>
       </w:r>
     </w:p>
     <w:p>

</xml_diff>